<commit_message>
Separate manuscript title, abstract, and body pages
</commit_message>
<xml_diff>
--- a/_extensions/gbt7714-paper/paper-reference.docx
+++ b/_extensions/gbt7714-paper/paper-reference.docx
@@ -314,6 +314,7 @@
       </w:r>
     </w:p>
     <w:sectPr>
+      <w:headerReference w:type="default" r:id="rIdPaperPageHeader"/>
       <w:footnotePr>
         <w:numRestart w:val="eachSect"/>
       </w:footnotePr>
@@ -482,6 +483,22 @@
 </w:numbering>
 </file>
 
+<file path=word/paper-header.xml><?xml version="1.0" encoding="utf-8"?>
+<w:hdr xmlns:w="http://schemas.openxmlformats.org/wordprocessingml/2006/main">
+  <w:p>
+    <w:pPr>
+      <w:jc w:val="right"/>
+      <w:spacing w:before="0" w:after="0"/>
+    </w:pPr>
+    <w:fldSimple w:instr="PAGE">
+      <w:r>
+        <w:t>1</w:t>
+      </w:r>
+    </w:fldSimple>
+  </w:p>
+</w:hdr>
+</file>
+
 <file path=word/styles.xml><?xml version="1.0" encoding="utf-8"?>
 <w:styles xmlns:w="http://schemas.openxmlformats.org/wordprocessingml/2006/main">
   <w:docDefaults>
@@ -535,6 +552,7 @@
     <w:qFormat/>
     <w:pPr>
       <w:spacing w:before="36" w:after="36"/>
+      <w:keepNext/>
     </w:pPr>
   </w:style>
   <w:style w:type="paragraph" w:styleId="Title">
@@ -1241,6 +1259,78 @@
       <w:b w:val="0"/>
       <w:bCs w:val="0"/>
       <w:color w:val="000000"/>
+    </w:rPr>
+  </w:style>
+  <w:style w:type="paragraph" w:styleId="ManuscriptTitle">
+    <w:name w:val="ManuscriptTitle"/>
+    <w:basedOn w:val="BodyText"/>
+    <w:pPr>
+      <w:spacing w:before="1440" w:after="240" w:line="480" w:lineRule="auto"/>
+      <w:ind w:firstLine="0"/>
+      <w:widowControl/>
+      <w:jc w:val="center"/>
+      <w:keepNext/>
+    </w:pPr>
+    <w:rPr>
+      <w:sz w:val="24"/>
+      <w:szCs w:val="24"/>
+      <w:b/>
+    </w:rPr>
+  </w:style>
+  <w:style w:type="paragraph" w:styleId="ManuscriptAuthor">
+    <w:name w:val="ManuscriptAuthor"/>
+    <w:basedOn w:val="BodyText"/>
+    <w:pPr>
+      <w:spacing w:before="0" w:after="0" w:line="480" w:lineRule="auto"/>
+      <w:ind w:firstLine="0"/>
+      <w:widowControl/>
+      <w:jc w:val="center"/>
+    </w:pPr>
+    <w:rPr>
+      <w:sz w:val="24"/>
+      <w:szCs w:val="24"/>
+    </w:rPr>
+  </w:style>
+  <w:style w:type="paragraph" w:styleId="ManuscriptHeading">
+    <w:name w:val="ManuscriptHeading"/>
+    <w:basedOn w:val="BodyText"/>
+    <w:pPr>
+      <w:spacing w:before="0" w:after="240" w:line="480" w:lineRule="auto"/>
+      <w:ind w:firstLine="0"/>
+      <w:widowControl/>
+      <w:jc w:val="center"/>
+      <w:keepNext/>
+    </w:pPr>
+    <w:rPr>
+      <w:sz w:val="24"/>
+      <w:szCs w:val="24"/>
+      <w:b/>
+    </w:rPr>
+  </w:style>
+  <w:style w:type="paragraph" w:styleId="ManuscriptAbstract">
+    <w:name w:val="ManuscriptAbstract"/>
+    <w:basedOn w:val="BodyText"/>
+    <w:pPr>
+      <w:spacing w:before="0" w:after="0" w:line="480" w:lineRule="auto"/>
+      <w:ind w:firstLine="0"/>
+      <w:widowControl/>
+    </w:pPr>
+    <w:rPr>
+      <w:sz w:val="24"/>
+      <w:szCs w:val="24"/>
+    </w:rPr>
+  </w:style>
+  <w:style w:type="paragraph" w:styleId="ManuscriptBody">
+    <w:name w:val="ManuscriptBody"/>
+    <w:basedOn w:val="BodyText"/>
+    <w:pPr>
+      <w:spacing w:before="0" w:after="0" w:line="480" w:lineRule="auto"/>
+      <w:ind w:firstLine="480"/>
+      <w:widowControl/>
+    </w:pPr>
+    <w:rPr>
+      <w:sz w:val="24"/>
+      <w:szCs w:val="24"/>
     </w:rPr>
   </w:style>
 </w:styles>

</xml_diff>

<commit_message>
Focus on template integration and tighten manuscript spacing
</commit_message>
<xml_diff>
--- a/_extensions/gbt7714-paper/paper-reference.docx
+++ b/_extensions/gbt7714-paper/paper-reference.docx
@@ -1265,7 +1265,7 @@
     <w:name w:val="ManuscriptTitle"/>
     <w:basedOn w:val="BodyText"/>
     <w:pPr>
-      <w:spacing w:before="1440" w:after="240" w:line="480" w:lineRule="auto"/>
+      <w:spacing w:before="1440" w:after="240" w:line="500" w:lineRule="exact"/>
       <w:ind w:firstLine="0"/>
       <w:widowControl/>
       <w:jc w:val="center"/>
@@ -1281,7 +1281,7 @@
     <w:name w:val="ManuscriptAuthor"/>
     <w:basedOn w:val="BodyText"/>
     <w:pPr>
-      <w:spacing w:before="0" w:after="0" w:line="480" w:lineRule="auto"/>
+      <w:spacing w:before="0" w:after="0" w:line="500" w:lineRule="exact"/>
       <w:ind w:firstLine="0"/>
       <w:widowControl/>
       <w:jc w:val="center"/>
@@ -1295,7 +1295,7 @@
     <w:name w:val="ManuscriptHeading"/>
     <w:basedOn w:val="BodyText"/>
     <w:pPr>
-      <w:spacing w:before="0" w:after="240" w:line="480" w:lineRule="auto"/>
+      <w:spacing w:before="0" w:after="240" w:line="500" w:lineRule="exact"/>
       <w:ind w:firstLine="0"/>
       <w:widowControl/>
       <w:jc w:val="center"/>
@@ -1311,7 +1311,7 @@
     <w:name w:val="ManuscriptAbstract"/>
     <w:basedOn w:val="BodyText"/>
     <w:pPr>
-      <w:spacing w:before="0" w:after="0" w:line="480" w:lineRule="auto"/>
+      <w:spacing w:before="0" w:after="0" w:line="500" w:lineRule="exact"/>
       <w:ind w:firstLine="0"/>
       <w:widowControl/>
     </w:pPr>
@@ -1324,7 +1324,7 @@
     <w:name w:val="ManuscriptBody"/>
     <w:basedOn w:val="BodyText"/>
     <w:pPr>
-      <w:spacing w:before="0" w:after="0" w:line="480" w:lineRule="auto"/>
+      <w:spacing w:before="0" w:after="0" w:line="500" w:lineRule="atLeast"/>
       <w:ind w:firstLine="480"/>
       <w:widowControl/>
     </w:pPr>

</xml_diff>